<commit_message>
Taller: el operario ve Producción, carga en tolva y cierra el día
El operario de inyección (PIN) entra a Producción, registra la carga en tolva
y hace el cierre del día del ciclo. No inicia ciclos (también bloqueado por
URL), no retira ni devuelve material, no cierra retiros ni corrige. Manual de
uso actualizado.

Co-Authored-By: Claude Opus 5.5 <noreply@anthropic.com>
</commit_message>
<xml_diff>
--- a/docs/entregables/manual-de-uso-nexa.docx
+++ b/docs/entregables/manual-de-uso-nexa.docx
@@ -479,7 +479,7 @@
               <w:rPr>
                 <w:sz w:val="18"/>
               </w:rPr>
-              <w:t>Operación de máquina</w:t>
+              <w:t>Taller (operario)</w:t>
             </w:r>
           </w:p>
         </w:tc>
@@ -501,13 +501,13 @@
                 <w:b/>
                 <w:sz w:val="18"/>
               </w:rPr>
-              <w:t xml:space="preserve">En el retiro o en el ciclo → «Cargar en tolva». </w:t>
+              <w:t xml:space="preserve">Producción → el ciclo en curso → «Cargar en tolva». </w:t>
             </w:r>
             <w:r>
               <w:rPr>
                 <w:sz w:val="18"/>
               </w:rPr>
-              <w:t>Registrar los kg a medida que se cargan (puede ser en varios turnos). Lo que no se usa: «Devolver sin mezclar». Lo ya mezclado con master: «Registrar sobrante».</w:t>
+              <w:t>Registrar los kg a medida que se cargan (puede ser en varios turnos). Lo que no se usa lo devuelve Retiro de MP con «Devolver sin mezclar»; lo ya mezclado con master, con «Registrar sobrante».</w:t>
             </w:r>
           </w:p>
         </w:tc>
@@ -551,7 +551,7 @@
               <w:rPr>
                 <w:sz w:val="18"/>
               </w:rPr>
-              <w:t>Encargado</w:t>
+              <w:t>Taller / Encargado</w:t>
             </w:r>
           </w:p>
         </w:tc>
@@ -1071,7 +1071,7 @@
               <w:rPr>
                 <w:sz w:val="18"/>
               </w:rPr>
-              <w:t>Pedidos, clientes, reclamos, remito legal, avisos de pedido listo. Ve precios.</w:t>
+              <w:t>Pedidos, clientes, reclamos, remito legal, avisos de pedido listo, alta de usuarios de taller. Ve precios.</w:t>
             </w:r>
           </w:p>
         </w:tc>
@@ -1159,7 +1159,7 @@
               <w:rPr>
                 <w:sz w:val="18"/>
               </w:rPr>
-              <w:t>Lo mismo que el Encargado, más resolución de reclamos, vista de precios a elección y correcciones.</w:t>
+              <w:t>Lo mismo que el Encargado, más resolución de reclamos, vista de precios a elección, correcciones y alta de usuarios de taller.</w:t>
             </w:r>
           </w:p>
         </w:tc>
@@ -1248,6 +1248,50 @@
                 <w:sz w:val="18"/>
               </w:rPr>
               <w:t>Armado, primer control y control final de los despachos.</w:t>
+            </w:r>
+          </w:p>
+        </w:tc>
+      </w:tr>
+      <w:tr>
+        <w:tc>
+          <w:tcPr>
+            <w:tcW w:type="dxa" w:w="2608"/>
+          </w:tcPr>
+          <w:p>
+            <w:pPr>
+              <w:spacing w:after="0"/>
+            </w:pPr>
+            <w:r>
+              <w:rPr>
+                <w:sz w:val="18"/>
+              </w:rPr>
+            </w:r>
+            <w:r>
+              <w:rPr>
+                <w:sz w:val="18"/>
+              </w:rPr>
+              <w:t>Taller (operario, entra con PIN)</w:t>
+            </w:r>
+          </w:p>
+        </w:tc>
+        <w:tc>
+          <w:tcPr>
+            <w:tcW w:type="dxa" w:w="7483"/>
+          </w:tcPr>
+          <w:p>
+            <w:pPr>
+              <w:spacing w:after="0"/>
+            </w:pPr>
+            <w:r>
+              <w:rPr>
+                <w:sz w:val="18"/>
+              </w:rPr>
+            </w:r>
+            <w:r>
+              <w:rPr>
+                <w:sz w:val="18"/>
+              </w:rPr>
+              <w:t>Ve Producción; registra la carga en tolva y el cierre del día del ciclo. No inicia ciclos ni retira material.</w:t>
             </w:r>
           </w:p>
         </w:tc>

</xml_diff>

<commit_message>
Inicio para supervisión remota, login, configuración, puesta en marcha, documentación e informe
- Inicio: producción en curso, entregas próximas, novedades y compras.
- Login con la identidad de Nexa; advertencia de la discrepancia del master;
  colada por golpe por producto; formulario manual sin cálculo en g/kg.
- scripts/puesta-en-marcha.ts: respaldo, simulación y ejecución sólo con
  confirmación explícita (archiva, no borra; ajustes de inventario auditados).
- docs/13 (rediseño, reglas y preguntas abiertas) y docs/14 (arranque limpio).
- Informe para el cliente y manual de uso actualizado.

Co-Authored-By: Claude Opus 5.5 <noreply@anthropic.com>
</commit_message>
<xml_diff>
--- a/docs/entregables/manual-de-uso-nexa.docx
+++ b/docs/entregables/manual-de-uso-nexa.docx
@@ -37,7 +37,7 @@
         <w:t xml:space="preserve">Entrar: </w:t>
       </w:r>
       <w:r>
-        <w:t>abrir nexa-erp-two.vercel.app → «Entrar al sistema». Administración, Supervisión, Gerencia y demás sectores ingresan con email y contraseña; los operarios eligen su nombre e ingresan su PIN.</w:t>
+        <w:t>abrir nexa-erp-two.vercel.app → «Entrar al sistema». Oficina, Supervisión y Gerencia: email y contraseña. Planta: elegir el nombre e ingresar el PIN.</w:t>
       </w:r>
     </w:p>
     <w:p>
@@ -48,10 +48,10 @@
         <w:rPr>
           <w:b/>
         </w:rPr>
-        <w:t xml:space="preserve">Menú lateral: </w:t>
+        <w:t xml:space="preserve">Cada usuario entra a su pantalla: </w:t>
       </w:r>
       <w:r>
-        <w:t>Tablero y Avisos arriba; luego tres áreas. Ventas: Pedidos, Stock / Productos, Clientes, Reclamos. Fábrica: Producción, Materia prima, Trazabilidad. Administración: Panel Admin.</w:t>
+        <w:t>el operario a «Mi turno» (celular), Materia prima a su stock, el Encargado a Producción y el resto a Inicio. Menú: Ventas (Pedidos, Stock de productos, Clientes, Reclamos), Fábrica (Producción, Materia prima, Trazabilidad) y Administración (Usuarios, Parámetros, Configuración, Historial de cambios).</w:t>
       </w:r>
     </w:p>
     <w:p>
@@ -62,24 +62,10 @@
         <w:rPr>
           <w:b/>
         </w:rPr>
-        <w:t xml:space="preserve">Cada usuario ve sólo lo que le corresponde a su rol. </w:t>
+        <w:t xml:space="preserve">Si un botón no aparece, </w:t>
       </w:r>
       <w:r>
-        <w:t>Si una sección o un botón no aparece, no es un error: esa tarea la realiza otro sector (ver tabla del punto 4).</w:t>
-      </w:r>
-    </w:p>
-    <w:p>
-      <w:pPr>
-        <w:pStyle w:val="ListBullet"/>
-      </w:pPr>
-      <w:r>
-        <w:rPr>
-          <w:b/>
-        </w:rPr>
-        <w:t xml:space="preserve">Avisos: </w:t>
-      </w:r>
-      <w:r>
-        <w:t>el número rojo junto a «Avisos» indica avisos pendientes (pedido listo para despachar, reclamo nuevo, informe de reclamo).</w:t>
+        <w:t>esa tarea es de otro sector (punto 4). Los datos ya cargados los corrigen Supervisión o Gerencia: ante un error, usar «Informar un error» (abajo del menú).</w:t>
       </w:r>
     </w:p>
     <w:p>
@@ -99,8 +85,8 @@
       </w:tblPr>
       <w:tblGrid>
         <w:gridCol w:w="454"/>
-        <w:gridCol w:w="1474"/>
-        <w:gridCol w:w="8164"/>
+        <w:gridCol w:w="1361"/>
+        <w:gridCol w:w="8277"/>
       </w:tblGrid>
       <w:tr>
         <w:tc>
@@ -121,7 +107,7 @@
         </w:tc>
         <w:tc>
           <w:tcPr>
-            <w:tcW w:type="dxa" w:w="1474"/>
+            <w:tcW w:type="dxa" w:w="1361"/>
             <w:shd w:val="clear" w:color="auto" w:fill="E2F0F1"/>
           </w:tcPr>
           <w:p>
@@ -137,7 +123,7 @@
         </w:tc>
         <w:tc>
           <w:tcPr>
-            <w:tcW w:type="dxa" w:w="8164"/>
+            <w:tcW w:type="dxa" w:w="8277"/>
             <w:shd w:val="clear" w:color="auto" w:fill="E2F0F1"/>
           </w:tcPr>
           <w:p>
@@ -176,7 +162,7 @@
         </w:tc>
         <w:tc>
           <w:tcPr>
-            <w:tcW w:type="dxa" w:w="1474"/>
+            <w:tcW w:type="dxa" w:w="1361"/>
           </w:tcPr>
           <w:p>
             <w:pPr>
@@ -197,7 +183,7 @@
         </w:tc>
         <w:tc>
           <w:tcPr>
-            <w:tcW w:type="dxa" w:w="8164"/>
+            <w:tcW w:type="dxa" w:w="8277"/>
           </w:tcPr>
           <w:p>
             <w:pPr>
@@ -219,7 +205,7 @@
               <w:rPr>
                 <w:sz w:val="18"/>
               </w:rPr>
-              <w:t>Elegir cliente y fecha de entrega. Cada renglón es un producto + color + cantidad (un pedido con 3 colores = 3 renglones). El resumen muestra baldosas, accesorios y m². «Crear pedido».</w:t>
+              <w:t>Cliente, fecha de entrega y un renglón por producto + color + cantidad. Si es urgente, en el pedido: Prioridad → Urgente / Adelantado / Postergado, con motivo.</w:t>
             </w:r>
           </w:p>
         </w:tc>
@@ -248,7 +234,7 @@
         </w:tc>
         <w:tc>
           <w:tcPr>
-            <w:tcW w:type="dxa" w:w="1474"/>
+            <w:tcW w:type="dxa" w:w="1361"/>
           </w:tcPr>
           <w:p>
             <w:pPr>
@@ -263,13 +249,13 @@
               <w:rPr>
                 <w:sz w:val="18"/>
               </w:rPr>
-              <w:t>Ventas / Encargado</w:t>
+              <w:t>Encargado</w:t>
             </w:r>
           </w:p>
         </w:tc>
         <w:tc>
           <w:tcPr>
-            <w:tcW w:type="dxa" w:w="8164"/>
+            <w:tcW w:type="dxa" w:w="8277"/>
           </w:tcPr>
           <w:p>
             <w:pPr>
@@ -285,13 +271,13 @@
                 <w:b/>
                 <w:sz w:val="18"/>
               </w:rPr>
-              <w:t xml:space="preserve">Ver la situación. </w:t>
+              <w:t xml:space="preserve">Producción → Planificación. </w:t>
             </w:r>
             <w:r>
               <w:rPr>
                 <w:sz w:val="18"/>
               </w:rPr>
-              <w:t>En la lista de pedidos, la columna «Situación» dice si hay «Stock disponible para armar» o «Falta producir N». Lo faltante aparece solo en Producción, en la cola ordenada por prioridad y fecha de entrega.</w:t>
+              <w:t>A la derecha, «Por planificar» junta todos los pedidos de cada producto y color. «Planificar tanda»: destildar los pedidos que quedan para después y sumar extra para stock. La tanda pasa a la secuencia (izquierda).</w:t>
             </w:r>
           </w:p>
         </w:tc>
@@ -320,7 +306,7 @@
         </w:tc>
         <w:tc>
           <w:tcPr>
-            <w:tcW w:type="dxa" w:w="1474"/>
+            <w:tcW w:type="dxa" w:w="1361"/>
           </w:tcPr>
           <w:p>
             <w:pPr>
@@ -341,7 +327,7 @@
         </w:tc>
         <w:tc>
           <w:tcPr>
-            <w:tcW w:type="dxa" w:w="8164"/>
+            <w:tcW w:type="dxa" w:w="8277"/>
           </w:tcPr>
           <w:p>
             <w:pPr>
@@ -357,13 +343,13 @@
                 <w:b/>
                 <w:sz w:val="18"/>
               </w:rPr>
-              <w:t xml:space="preserve">Producción → «Producir →» (o «+ Nuevo ciclo»). </w:t>
+              <w:t xml:space="preserve">En la tanda: </w:t>
             </w:r>
             <w:r>
               <w:rPr>
                 <w:sz w:val="18"/>
               </w:rPr>
-              <w:t>Elegir el producto: la inyectora (baldosas: siempre la 8) y la partida se asignan solas. Ver necesidad de pedidos + reposición, cargar la «Inyección deseada» y los golpes de inicio → «Iniciar producción».</w:t>
+              <w:t>ordenarla con ↑ ↓, «Asignar máquina, turno y cantidades» y revisar la receta y el material. Avisos: cambio de matriz o de color, entrega próxima, falta de material. «Iniciar producción» con los golpes que marca la máquina.</w:t>
             </w:r>
           </w:p>
         </w:tc>
@@ -392,7 +378,7 @@
         </w:tc>
         <w:tc>
           <w:tcPr>
-            <w:tcW w:type="dxa" w:w="1474"/>
+            <w:tcW w:type="dxa" w:w="1361"/>
           </w:tcPr>
           <w:p>
             <w:pPr>
@@ -413,7 +399,7 @@
         </w:tc>
         <w:tc>
           <w:tcPr>
-            <w:tcW w:type="dxa" w:w="8164"/>
+            <w:tcW w:type="dxa" w:w="8277"/>
           </w:tcPr>
           <w:p>
             <w:pPr>
@@ -429,13 +415,13 @@
                 <w:b/>
                 <w:sz w:val="18"/>
               </w:rPr>
-              <w:t xml:space="preserve">En el ciclo → «Retirar materia prima a pie de máquina». </w:t>
+              <w:t xml:space="preserve">En la producción → «Retirar materia prima a pie de máquina». </w:t>
             </w:r>
             <w:r>
               <w:rPr>
                 <w:sz w:val="18"/>
               </w:rPr>
-              <w:t>Leer el código de barras de la bolsa (completa material, lote y certificado), agregar el master y las cantidades → «Registrar retiro». El material sale del depósito y queda junto a la máquina.</w:t>
+              <w:t>Leer el código de cada bolsa; «Agregar el material de la receta» completa cantidades. El material pasa del depósito al pie de máquina.</w:t>
             </w:r>
           </w:p>
         </w:tc>
@@ -464,7 +450,7 @@
         </w:tc>
         <w:tc>
           <w:tcPr>
-            <w:tcW w:type="dxa" w:w="1474"/>
+            <w:tcW w:type="dxa" w:w="1361"/>
           </w:tcPr>
           <w:p>
             <w:pPr>
@@ -479,13 +465,13 @@
               <w:rPr>
                 <w:sz w:val="18"/>
               </w:rPr>
-              <w:t>Taller (operario)</w:t>
+              <w:t>Operario</w:t>
             </w:r>
           </w:p>
         </w:tc>
         <w:tc>
           <w:tcPr>
-            <w:tcW w:type="dxa" w:w="8164"/>
+            <w:tcW w:type="dxa" w:w="8277"/>
           </w:tcPr>
           <w:p>
             <w:pPr>
@@ -501,13 +487,13 @@
                 <w:b/>
                 <w:sz w:val="18"/>
               </w:rPr>
-              <w:t xml:space="preserve">Producción → el ciclo en curso → «Cargar en tolva». </w:t>
+              <w:t xml:space="preserve">Mi turno → «Tomar el turno». </w:t>
             </w:r>
             <w:r>
               <w:rPr>
                 <w:sz w:val="18"/>
               </w:rPr>
-              <w:t>Registrar los kg a medida que se cargan (puede ser en varios turnos). Lo que no se usa lo devuelve Retiro de MP con «Devolver sin mezclar»; lo ya mezclado con master, con «Registrar sobrante».</w:t>
+              <w:t>Elegir turno y nombre; si hay relevo, confirmar si el material recibido coincide (o elegir qué falta). Los golpes vienen del turno anterior.</w:t>
             </w:r>
           </w:p>
         </w:tc>
@@ -536,7 +522,7 @@
         </w:tc>
         <w:tc>
           <w:tcPr>
-            <w:tcW w:type="dxa" w:w="1474"/>
+            <w:tcW w:type="dxa" w:w="1361"/>
           </w:tcPr>
           <w:p>
             <w:pPr>
@@ -551,13 +537,13 @@
               <w:rPr>
                 <w:sz w:val="18"/>
               </w:rPr>
-              <w:t>Taller / Encargado</w:t>
+              <w:t>Operario</w:t>
             </w:r>
           </w:p>
         </w:tc>
         <w:tc>
           <w:tcPr>
-            <w:tcW w:type="dxa" w:w="8164"/>
+            <w:tcW w:type="dxa" w:w="8277"/>
           </w:tcPr>
           <w:p>
             <w:pPr>
@@ -573,13 +559,13 @@
                 <w:b/>
                 <w:sz w:val="18"/>
               </w:rPr>
-              <w:t xml:space="preserve">Al terminar la jornada, en el ciclo: «Cierre del día». </w:t>
+              <w:t xml:space="preserve">«Cargué la tanda completa». </w:t>
             </w:r>
             <w:r>
               <w:rPr>
                 <w:sz w:val="18"/>
               </w:rPr>
-              <w:t>Cargar golpes de fin y piezas descartadas; las piezas a stock se calculan solas. «Cerrar ciclo»: entran al stock en cajas (25 por caja en pisos). Al día siguiente, el mismo producto continúa la misma partida.</w:t>
+              <w:t>Un toque por cada carga de la receta (ej. 4 bolsas de 25 kg + 2 bolsitas de 600 g). Si se cargó distinto: «Cargué distinto», + / − y el motivo. Si no se pudo: «No pude cargar» y el motivo.</w:t>
             </w:r>
           </w:p>
         </w:tc>
@@ -608,7 +594,7 @@
         </w:tc>
         <w:tc>
           <w:tcPr>
-            <w:tcW w:type="dxa" w:w="1474"/>
+            <w:tcW w:type="dxa" w:w="1361"/>
           </w:tcPr>
           <w:p>
             <w:pPr>
@@ -623,13 +609,13 @@
               <w:rPr>
                 <w:sz w:val="18"/>
               </w:rPr>
-              <w:t>Retiro de MP</w:t>
+              <w:t>Operario</w:t>
             </w:r>
           </w:p>
         </w:tc>
         <w:tc>
           <w:tcPr>
-            <w:tcW w:type="dxa" w:w="8164"/>
+            <w:tcW w:type="dxa" w:w="8277"/>
           </w:tcPr>
           <w:p>
             <w:pPr>
@@ -645,13 +631,13 @@
                 <w:b/>
                 <w:sz w:val="18"/>
               </w:rPr>
-              <w:t xml:space="preserve">En el retiro → «Conciliar y cerrar retiro». </w:t>
+              <w:t xml:space="preserve">«Terminar mi turno». </w:t>
             </w:r>
             <w:r>
               <w:rPr>
                 <w:sz w:val="18"/>
               </w:rPr>
-              <w:t>Se cierra cuando no queda material a pie de máquina; si hay diferencia de balanza, se escribe la justificación.</w:t>
+              <w:t>Golpes que marca la máquina, descarte pesado en kg e interrupciones. El que entra ve lo que falta y el material heredado. Al terminar la tanda: «Terminó la producción»; lo bueno entra a stock en cajas.</w:t>
             </w:r>
           </w:p>
         </w:tc>
@@ -680,7 +666,7 @@
         </w:tc>
         <w:tc>
           <w:tcPr>
-            <w:tcW w:type="dxa" w:w="1474"/>
+            <w:tcW w:type="dxa" w:w="1361"/>
           </w:tcPr>
           <w:p>
             <w:pPr>
@@ -695,13 +681,13 @@
               <w:rPr>
                 <w:sz w:val="18"/>
               </w:rPr>
-              <w:t>Despacho</w:t>
+              <w:t>Retiro de MP</w:t>
             </w:r>
           </w:p>
         </w:tc>
         <w:tc>
           <w:tcPr>
-            <w:tcW w:type="dxa" w:w="8164"/>
+            <w:tcW w:type="dxa" w:w="8277"/>
           </w:tcPr>
           <w:p>
             <w:pPr>
@@ -717,13 +703,13 @@
                 <w:b/>
                 <w:sz w:val="18"/>
               </w:rPr>
-              <w:t xml:space="preserve">En el pedido → «Preparar despacho». </w:t>
+              <w:t xml:space="preserve">En el retiro → «Conciliar y cerrar retiro». </w:t>
             </w:r>
             <w:r>
               <w:rPr>
                 <w:sz w:val="18"/>
               </w:rPr>
-              <w:t>Leer cada caja (o el código de producto en accesorios). El sistema rechaza lo que no corresponde. «Confirmar primer control»: Administración recibe el aviso.</w:t>
+              <w:t>Lo sin usar vuelve con «Devolver sin mezclar»; lo mezclado, con «Registrar sobrante». Se cierra con el pie de máquina en cero (la diferencia de balanza se justifica).</w:t>
             </w:r>
           </w:p>
         </w:tc>
@@ -752,7 +738,7 @@
         </w:tc>
         <w:tc>
           <w:tcPr>
-            <w:tcW w:type="dxa" w:w="1474"/>
+            <w:tcW w:type="dxa" w:w="1361"/>
           </w:tcPr>
           <w:p>
             <w:pPr>
@@ -767,13 +753,13 @@
               <w:rPr>
                 <w:sz w:val="18"/>
               </w:rPr>
-              <w:t>Despacho / Encargado</w:t>
+              <w:t>Despacho</w:t>
             </w:r>
           </w:p>
         </w:tc>
         <w:tc>
           <w:tcPr>
-            <w:tcW w:type="dxa" w:w="8164"/>
+            <w:tcW w:type="dxa" w:w="8277"/>
           </w:tcPr>
           <w:p>
             <w:pPr>
@@ -789,13 +775,13 @@
                 <w:b/>
                 <w:sz w:val="18"/>
               </w:rPr>
-              <w:t xml:space="preserve">«Hacer control final»: </w:t>
+              <w:t xml:space="preserve">En el pedido → «Preparar despacho». </w:t>
             </w:r>
             <w:r>
               <w:rPr>
                 <w:sz w:val="18"/>
               </w:rPr>
-              <w:t>volver a leer lo que sale; tiene que coincidir con lo armado. «Confirmar control final y entregar»: descuenta el stock y numera el remito interno (R-000001…). Si falta mercadería, se entrega lo que hay y el pedido queda «Parcialmente despachado».</w:t>
+              <w:t>Leer cada caja (vacío = caja completa; si son sueltas, cantidad en baldosas, no en cajas). «Confirmar primer control»; después, «Hacer control final» y entregar: se numera el remito interno.</w:t>
             </w:r>
           </w:p>
         </w:tc>
@@ -824,7 +810,7 @@
         </w:tc>
         <w:tc>
           <w:tcPr>
-            <w:tcW w:type="dxa" w:w="1474"/>
+            <w:tcW w:type="dxa" w:w="1361"/>
           </w:tcPr>
           <w:p>
             <w:pPr>
@@ -845,7 +831,7 @@
         </w:tc>
         <w:tc>
           <w:tcPr>
-            <w:tcW w:type="dxa" w:w="8164"/>
+            <w:tcW w:type="dxa" w:w="8277"/>
           </w:tcPr>
           <w:p>
             <w:pPr>
@@ -867,7 +853,7 @@
               <w:rPr>
                 <w:sz w:val="18"/>
               </w:rPr>
-              <w:t>Ver o imprimir el remito (original y duplicado) y registrar el número del remito legal.</w:t>
+              <w:t>Imprimir el remito y registrar el número del remito legal.</w:t>
             </w:r>
           </w:p>
         </w:tc>
@@ -889,10 +875,10 @@
         <w:rPr>
           <w:b/>
         </w:rPr>
-        <w:t xml:space="preserve">Ingreso de materia prima (Materia prima → «+ Ingreso con certificado y lote»): </w:t>
+        <w:t xml:space="preserve">Recetas de carga (Encargado): </w:t>
       </w:r>
       <w:r>
-        <w:t>material, proveedor, kg y el código de barras de 27 dígitos, que al ingresar empieza con 000. Si tiene certificado de calidad, marcar la casilla: el sistema le asigna el número correlativo.</w:t>
+        <w:t>Configuración → Recetas de carga. Por producto y color, en bolsas y bolsitas (admite medias). Receta normal y, si hace falta, de arranque para el cambio de color.</w:t>
       </w:r>
     </w:p>
     <w:p>
@@ -903,10 +889,10 @@
         <w:rPr>
           <w:b/>
         </w:rPr>
-        <w:t xml:space="preserve">Stock: </w:t>
+        <w:t xml:space="preserve">Materia prima: </w:t>
       </w:r>
       <w:r>
-        <w:t>Stock / Productos (filtros Pisos / Accesorios, Rejilla / Ciego, «Solo alertas»). Materia prima muestra primero lo que está a pie de máquina y los movimientos a máquina.</w:t>
+        <w:t>«+ Ingreso de proveedor» (1.500 kg se escribe «1.500»; el sistema avisa si la cantidad es rara). Pestañas: Stock (depósito, pie de máquina, tolva), Movimientos día por día, Lotes y certificados, Ajustes (diferencia de balanza, bolsones de molienda, fraccionamiento de master).</w:t>
       </w:r>
     </w:p>
     <w:p>
@@ -917,10 +903,10 @@
         <w:rPr>
           <w:b/>
         </w:rPr>
-        <w:t xml:space="preserve">Reclamos: </w:t>
+        <w:t xml:space="preserve">Compras: </w:t>
       </w:r>
       <w:r>
-        <w:t>Ventas lo registra desde el pedido («Registrar reclamo», indicando la caja si se conoce). El Supervisor carga causa y solución, lo cierra y envía el informe a Gerencia.</w:t>
+        <w:t>Producción → Compras muestra el material que pide la planificación y cuánto falta.</w:t>
       </w:r>
     </w:p>
     <w:p>
@@ -931,52 +917,10 @@
         <w:rPr>
           <w:b/>
         </w:rPr>
-        <w:t xml:space="preserve">Trazabilidad: </w:t>
+        <w:t xml:space="preserve">Supervisión y Gerencia: </w:t>
       </w:r>
       <w:r>
-        <w:t>buscar por pedido, cliente, caja, partida, lote o certificado: muestra el recorrido completo, desde el certificado del proveedor hasta el cliente.</w:t>
-      </w:r>
-    </w:p>
-    <w:p>
-      <w:pPr>
-        <w:pStyle w:val="ListBullet"/>
-      </w:pPr>
-      <w:r>
-        <w:rPr>
-          <w:b/>
-        </w:rPr>
-        <w:t xml:space="preserve">Prioridad: </w:t>
-      </w:r>
-      <w:r>
-        <w:t>Encargado o Supervisor, desde el pedido, pueden marcarlo como Urgente, Adelantado o Postergado, indicando el motivo. Sin cambios, el orden lo da la fecha de entrega.</w:t>
-      </w:r>
-    </w:p>
-    <w:p>
-      <w:pPr>
-        <w:pStyle w:val="ListBullet"/>
-      </w:pPr>
-      <w:r>
-        <w:rPr>
-          <w:b/>
-        </w:rPr>
-        <w:t xml:space="preserve">Panel Admin: </w:t>
-      </w:r>
-      <w:r>
-        <w:t>mínimos y máximos (Stock), dosificación de master, datos de productos (m² y kg por pieza), colores especiales, parámetros, usuarios e historial de cambios.</w:t>
-      </w:r>
-    </w:p>
-    <w:p>
-      <w:pPr>
-        <w:pStyle w:val="ListBullet"/>
-      </w:pPr>
-      <w:r>
-        <w:rPr>
-          <w:b/>
-        </w:rPr>
-        <w:t xml:space="preserve">Supervisión: </w:t>
-      </w:r>
-      <w:r>
-        <w:t>el botón «Vista sin precios / Vista completa» alterna la vista de precios. El Supervisor también corrige errores de carga (anular un retiro o una carga, corregir el cierre de un ciclo o los kg de un lote); todo queda registrado con su motivo.</w:t>
+        <w:t>Inicio resume la operación (también a distancia). Corrigen datos con motivo, archivan pedidos de prueba y dan de alta productos, colores y materiales.</w:t>
       </w:r>
     </w:p>
     <w:p>
@@ -1050,7 +994,7 @@
               <w:rPr>
                 <w:sz w:val="18"/>
               </w:rPr>
-              <w:t>Administración (ventas)</w:t>
+              <w:t>Ventas (Administración)</w:t>
             </w:r>
           </w:p>
         </w:tc>
@@ -1071,7 +1015,7 @@
               <w:rPr>
                 <w:sz w:val="18"/>
               </w:rPr>
-              <w:t>Pedidos, clientes, reclamos, remito legal, avisos de pedido listo, alta de usuarios de taller. Ve precios.</w:t>
+              <w:t>Pedidos, prioridad, clientes, reclamos, remito legal; alta de usuarios de taller. Ve precios.</w:t>
             </w:r>
           </w:p>
         </w:tc>
@@ -1115,7 +1059,7 @@
               <w:rPr>
                 <w:sz w:val="18"/>
               </w:rPr>
-              <w:t>Producción (ciclos y cierres), prioridad, mínimos y máximos, retiro y carga de material, despacho.</w:t>
+              <w:t>Planificación, recetas, inicio y cierre de producción, mínimos, retiro de material, despacho.</w:t>
             </w:r>
           </w:p>
         </w:tc>
@@ -1138,7 +1082,7 @@
               <w:rPr>
                 <w:sz w:val="18"/>
               </w:rPr>
-              <w:t>Supervisor</w:t>
+              <w:t>Operario (PIN, celular)</w:t>
             </w:r>
           </w:p>
         </w:tc>
@@ -1159,7 +1103,7 @@
               <w:rPr>
                 <w:sz w:val="18"/>
               </w:rPr>
-              <w:t>Lo mismo que el Encargado, más resolución de reclamos, vista de precios a elección, correcciones y alta de usuarios de taller.</w:t>
+              <w:t>Mi turno: tomar turno, cargar la tolva con la receta, cerrar el turno y la producción.</w:t>
             </w:r>
           </w:p>
         </w:tc>
@@ -1203,7 +1147,7 @@
               <w:rPr>
                 <w:sz w:val="18"/>
               </w:rPr>
-              <w:t>Ingreso de materia prima con lote y certificado; retiros, carga en tolva, devoluciones y sobrantes.</w:t>
+              <w:t>Ingresos, lotes y certificados; retiros, devoluciones, sobrantes, ajustes de balanza, molienda y fraccionamiento.</w:t>
             </w:r>
           </w:p>
         </w:tc>
@@ -1247,7 +1191,7 @@
               <w:rPr>
                 <w:sz w:val="18"/>
               </w:rPr>
-              <w:t>Armado, primer control y control final de los despachos.</w:t>
+              <w:t>Armado, primer control y control final.</w:t>
             </w:r>
           </w:p>
         </w:tc>
@@ -1270,7 +1214,7 @@
               <w:rPr>
                 <w:sz w:val="18"/>
               </w:rPr>
-              <w:t>Taller (operario, entra con PIN)</w:t>
+              <w:t>Supervisor / Gerencia</w:t>
             </w:r>
           </w:p>
         </w:tc>
@@ -1291,51 +1235,7 @@
               <w:rPr>
                 <w:sz w:val="18"/>
               </w:rPr>
-              <w:t>Ve Producción; registra la carga en tolva y el cierre del día del ciclo. No inicia ciclos ni retira material.</w:t>
-            </w:r>
-          </w:p>
-        </w:tc>
-      </w:tr>
-      <w:tr>
-        <w:tc>
-          <w:tcPr>
-            <w:tcW w:type="dxa" w:w="2608"/>
-          </w:tcPr>
-          <w:p>
-            <w:pPr>
-              <w:spacing w:after="0"/>
-            </w:pPr>
-            <w:r>
-              <w:rPr>
-                <w:sz w:val="18"/>
-              </w:rPr>
-            </w:r>
-            <w:r>
-              <w:rPr>
-                <w:sz w:val="18"/>
-              </w:rPr>
-              <w:t>Gerencia</w:t>
-            </w:r>
-          </w:p>
-        </w:tc>
-        <w:tc>
-          <w:tcPr>
-            <w:tcW w:type="dxa" w:w="7483"/>
-          </w:tcPr>
-          <w:p>
-            <w:pPr>
-              <w:spacing w:after="0"/>
-            </w:pPr>
-            <w:r>
-              <w:rPr>
-                <w:sz w:val="18"/>
-              </w:rPr>
-            </w:r>
-            <w:r>
-              <w:rPr>
-                <w:sz w:val="18"/>
-              </w:rPr>
-              <w:t>Todo, más usuarios, informes de reclamos y todos los avisos.</w:t>
+              <w:t>Todo lo anterior, más correcciones, reclamos, altas estructurales y archivado. Supervisor: vista con o sin precios.</w:t>
             </w:r>
           </w:p>
         </w:tc>
@@ -1357,10 +1257,10 @@
         <w:rPr>
           <w:b/>
         </w:rPr>
-        <w:t xml:space="preserve">«El control final no coincide con lo armado»: </w:t>
+        <w:t xml:space="preserve">«Tomá el turno antes de cargar la tolva»: </w:t>
       </w:r>
       <w:r>
-        <w:t>falta releer alguna caja o producto de los armados. La lista de lecturas indica qué se leyó.</w:t>
+        <w:t>falta el paso 5.</w:t>
       </w:r>
     </w:p>
     <w:p>
@@ -1371,10 +1271,24 @@
         <w:rPr>
           <w:b/>
         </w:rPr>
-        <w:t xml:space="preserve">Una lectura queda «con alerta (no suma)»: </w:t>
+        <w:t xml:space="preserve">«A pie de máquina hay X kg… la carga pide Y»: </w:t>
       </w:r>
       <w:r>
-        <w:t>la caja no corresponde al pedido, ya fue usada o excede lo pendiente. Es un control, no un error.</w:t>
+        <w:t>falta retirar material; o cargar lo que hay con «Cargué distinto».</w:t>
+      </w:r>
+    </w:p>
+    <w:p>
+      <w:pPr>
+        <w:pStyle w:val="ListBullet"/>
+      </w:pPr>
+      <w:r>
+        <w:rPr>
+          <w:b/>
+        </w:rPr>
+        <w:t xml:space="preserve">«Sin receta de carga»: </w:t>
+      </w:r>
+      <w:r>
+        <w:t>el Encargado tiene que definirla en Configuración.</w:t>
       </w:r>
     </w:p>
     <w:p>
@@ -1388,7 +1302,7 @@
         <w:t xml:space="preserve">No se puede cerrar el retiro: </w:t>
       </w:r>
       <w:r>
-        <w:t>queda material a pie de máquina; cargarlo, devolverlo o escribir la justificación de la diferencia.</w:t>
+        <w:t>queda material a pie de máquina; devolverlo, registrarlo como sobrante o justificar la diferencia.</w:t>
       </w:r>
     </w:p>
     <w:p>
@@ -1399,10 +1313,10 @@
         <w:rPr>
           <w:b/>
         </w:rPr>
-        <w:t xml:space="preserve">No se puede continuar la partida: </w:t>
+        <w:t xml:space="preserve">«El control final no coincide con lo armado»: </w:t>
       </w:r>
       <w:r>
-        <w:t>el ciclo del día anterior sigue abierto; cerrarlo primero (de ahí salen los golpes de inicio).</w:t>
+        <w:t>falta releer alguna caja; la lista de lecturas muestra qué se leyó.</w:t>
       </w:r>
     </w:p>
     <w:p>
@@ -1413,38 +1327,10 @@
         <w:rPr>
           <w:b/>
         </w:rPr>
-        <w:t xml:space="preserve">Un pedido figura «Falta producir»: </w:t>
+        <w:t xml:space="preserve">«Datos pendientes» en un pedido: </w:t>
       </w:r>
       <w:r>
-        <w:t>no hay stock suficiente para todos los pedidos según la prioridad; producir o esperar la producción.</w:t>
-      </w:r>
-    </w:p>
-    <w:p>
-      <w:pPr>
-        <w:pStyle w:val="ListBullet"/>
-      </w:pPr>
-      <w:r>
-        <w:rPr>
-          <w:b/>
-        </w:rPr>
-        <w:t xml:space="preserve">Un renglón dice «Dato pendiente»: </w:t>
-      </w:r>
-      <w:r>
-        <w:t>es un pedido viejo del Excel con varios colores en una sola cantidad; hay que confirmar con el cliente cuántas unidades son de cada color.</w:t>
-      </w:r>
-    </w:p>
-    <w:p>
-      <w:pPr>
-        <w:pStyle w:val="ListBullet"/>
-      </w:pPr>
-      <w:r>
-        <w:rPr>
-          <w:b/>
-        </w:rPr>
-        <w:t xml:space="preserve">Tras un mensaje de error, el formulario quedó vacío: </w:t>
-      </w:r>
-      <w:r>
-        <w:t>corregir el dato indicado y volver a cargar el formulario.</w:t>
+        <w:t>renglón viejo del Excel sin producto; Ventas confirma el color y la cantidad.</w:t>
       </w:r>
     </w:p>
     <w:p>
@@ -1463,13 +1349,13 @@
         <w:tblLook w:firstColumn="1" w:firstRow="1" w:lastColumn="0" w:lastRow="0" w:noHBand="0" w:noVBand="1" w:val="04A0"/>
       </w:tblPr>
       <w:tblGrid>
-        <w:gridCol w:w="2381"/>
-        <w:gridCol w:w="7710"/>
+        <w:gridCol w:w="2494"/>
+        <w:gridCol w:w="7597"/>
       </w:tblGrid>
       <w:tr>
         <w:tc>
           <w:tcPr>
-            <w:tcW w:type="dxa" w:w="2381"/>
+            <w:tcW w:type="dxa" w:w="2494"/>
             <w:shd w:val="clear" w:color="auto" w:fill="E2F0F1"/>
           </w:tcPr>
           <w:p>
@@ -1485,7 +1371,7 @@
         </w:tc>
         <w:tc>
           <w:tcPr>
-            <w:tcW w:type="dxa" w:w="7710"/>
+            <w:tcW w:type="dxa" w:w="7597"/>
             <w:shd w:val="clear" w:color="auto" w:fill="E2F0F1"/>
           </w:tcPr>
           <w:p>
@@ -1503,7 +1389,7 @@
       <w:tr>
         <w:tc>
           <w:tcPr>
-            <w:tcW w:type="dxa" w:w="2381"/>
+            <w:tcW w:type="dxa" w:w="2494"/>
           </w:tcPr>
           <w:p>
             <w:pPr>
@@ -1518,13 +1404,13 @@
               <w:rPr>
                 <w:sz w:val="18"/>
               </w:rPr>
-              <w:t>Ciclo</w:t>
+              <w:t>Tanda</w:t>
             </w:r>
           </w:p>
         </w:tc>
         <w:tc>
           <w:tcPr>
-            <w:tcW w:type="dxa" w:w="7710"/>
+            <w:tcW w:type="dxa" w:w="7597"/>
           </w:tcPr>
           <w:p>
             <w:pPr>
@@ -1539,7 +1425,7 @@
               <w:rPr>
                 <w:sz w:val="18"/>
               </w:rPr>
-              <w:t>Una jornada de producción de un producto en una inyectora: se inicia con los golpes de inicio y se cierra con el «Cierre del día».</w:t>
+              <w:t>Producto y color a producir, con sus pedidos y cantidad objetivo, en un lugar de la secuencia.</w:t>
             </w:r>
           </w:p>
         </w:tc>
@@ -1547,7 +1433,7 @@
       <w:tr>
         <w:tc>
           <w:tcPr>
-            <w:tcW w:type="dxa" w:w="2381"/>
+            <w:tcW w:type="dxa" w:w="2494"/>
           </w:tcPr>
           <w:p>
             <w:pPr>
@@ -1562,13 +1448,13 @@
               <w:rPr>
                 <w:sz w:val="18"/>
               </w:rPr>
-              <w:t>Partida</w:t>
+              <w:t>Producción</w:t>
             </w:r>
           </w:p>
         </w:tc>
         <w:tc>
           <w:tcPr>
-            <w:tcW w:type="dxa" w:w="7710"/>
+            <w:tcW w:type="dxa" w:w="7597"/>
           </w:tcPr>
           <w:p>
             <w:pPr>
@@ -1583,7 +1469,7 @@
               <w:rPr>
                 <w:sz w:val="18"/>
               </w:rPr>
-              <w:t>Número que agrupa todos los ciclos seguidos de un mismo producto y color. Se asigna sola y continúa mientras se siga produciendo lo mismo.</w:t>
+              <w:t>Lo que se inyecta de una tanda en una máquina, de su inicio a su cierre; puede durar varios turnos.</w:t>
             </w:r>
           </w:p>
         </w:tc>
@@ -1591,7 +1477,7 @@
       <w:tr>
         <w:tc>
           <w:tcPr>
-            <w:tcW w:type="dxa" w:w="2381"/>
+            <w:tcW w:type="dxa" w:w="2494"/>
           </w:tcPr>
           <w:p>
             <w:pPr>
@@ -1606,13 +1492,13 @@
               <w:rPr>
                 <w:sz w:val="18"/>
               </w:rPr>
-              <w:t>Golpes</w:t>
+              <w:t>Relevo</w:t>
             </w:r>
           </w:p>
         </w:tc>
         <w:tc>
           <w:tcPr>
-            <w:tcW w:type="dxa" w:w="7710"/>
+            <w:tcW w:type="dxa" w:w="7597"/>
           </w:tcPr>
           <w:p>
             <w:pPr>
@@ -1627,7 +1513,7 @@
               <w:rPr>
                 <w:sz w:val="18"/>
               </w:rPr>
-              <w:t>Contador de la inyectora. Golpes de fin menos golpes de inicio, por las piezas por golpe, da las piezas producidas.</w:t>
+              <w:t>Cierre de un turno: golpes, piezas, descarte y material que recibe el turno siguiente.</w:t>
             </w:r>
           </w:p>
         </w:tc>
@@ -1635,7 +1521,7 @@
       <w:tr>
         <w:tc>
           <w:tcPr>
-            <w:tcW w:type="dxa" w:w="2381"/>
+            <w:tcW w:type="dxa" w:w="2494"/>
           </w:tcPr>
           <w:p>
             <w:pPr>
@@ -1650,13 +1536,13 @@
               <w:rPr>
                 <w:sz w:val="18"/>
               </w:rPr>
-              <w:t>Lote de materia prima</w:t>
+              <w:t>Receta de carga</w:t>
             </w:r>
           </w:p>
         </w:tc>
         <w:tc>
           <w:tcPr>
-            <w:tcW w:type="dxa" w:w="7710"/>
+            <w:tcW w:type="dxa" w:w="7597"/>
           </w:tcPr>
           <w:p>
             <w:pPr>
@@ -1671,7 +1557,7 @@
               <w:rPr>
                 <w:sz w:val="18"/>
               </w:rPr>
-              <w:t>Cada ingreso de material, identificado por su código de barras de 27 dígitos y, si corresponde, su certificado de calidad.</w:t>
+              <w:t>Bolsas de cada material que van en cada carga de tolva (normal o de arranque).</w:t>
             </w:r>
           </w:p>
         </w:tc>
@@ -1679,7 +1565,7 @@
       <w:tr>
         <w:tc>
           <w:tcPr>
-            <w:tcW w:type="dxa" w:w="2381"/>
+            <w:tcW w:type="dxa" w:w="2494"/>
           </w:tcPr>
           <w:p>
             <w:pPr>
@@ -1694,13 +1580,13 @@
               <w:rPr>
                 <w:sz w:val="18"/>
               </w:rPr>
-              <w:t>Pie de máquina</w:t>
+              <w:t>Depósito / pie de máquina / tolva</w:t>
             </w:r>
           </w:p>
         </w:tc>
         <w:tc>
           <w:tcPr>
-            <w:tcW w:type="dxa" w:w="7710"/>
+            <w:tcW w:type="dxa" w:w="7597"/>
           </w:tcPr>
           <w:p>
             <w:pPr>
@@ -1715,7 +1601,7 @@
               <w:rPr>
                 <w:sz w:val="18"/>
               </w:rPr>
-              <w:t>Material que ya salió del depósito y está junto a la inyectora, todavía sin cargar en la tolva. Debe quedar en cero al cerrar el retiro.</w:t>
+              <w:t>Dónde está el material: en el depósito, retirado junto a la máquina, o cargado en la máquina.</w:t>
             </w:r>
           </w:p>
         </w:tc>
@@ -1723,7 +1609,7 @@
       <w:tr>
         <w:tc>
           <w:tcPr>
-            <w:tcW w:type="dxa" w:w="2381"/>
+            <w:tcW w:type="dxa" w:w="2494"/>
           </w:tcPr>
           <w:p>
             <w:pPr>
@@ -1738,13 +1624,13 @@
               <w:rPr>
                 <w:sz w:val="18"/>
               </w:rPr>
-              <w:t>Tolva</w:t>
+              <w:t>Partida NEXA</w:t>
             </w:r>
           </w:p>
         </w:tc>
         <w:tc>
           <w:tcPr>
-            <w:tcW w:type="dxa" w:w="7710"/>
+            <w:tcW w:type="dxa" w:w="7597"/>
           </w:tcPr>
           <w:p>
             <w:pPr>
@@ -1759,7 +1645,7 @@
               <w:rPr>
                 <w:sz w:val="18"/>
               </w:rPr>
-              <w:t>Recipiente de la inyectora donde se carga el material. Lo cargado queda asociado al ciclo y a la partida (base de la trazabilidad).</w:t>
+              <w:t>Número que agrupa lo producido con un mismo producto y color. No es el lote del proveedor.</w:t>
             </w:r>
           </w:p>
         </w:tc>
@@ -1767,51 +1653,7 @@
       <w:tr>
         <w:tc>
           <w:tcPr>
-            <w:tcW w:type="dxa" w:w="2381"/>
-          </w:tcPr>
-          <w:p>
-            <w:pPr>
-              <w:spacing w:after="0"/>
-            </w:pPr>
-            <w:r>
-              <w:rPr>
-                <w:sz w:val="18"/>
-              </w:rPr>
-            </w:r>
-            <w:r>
-              <w:rPr>
-                <w:sz w:val="18"/>
-              </w:rPr>
-              <w:t>Master</w:t>
-            </w:r>
-          </w:p>
-        </w:tc>
-        <w:tc>
-          <w:tcPr>
-            <w:tcW w:type="dxa" w:w="7710"/>
-          </w:tcPr>
-          <w:p>
-            <w:pPr>
-              <w:spacing w:after="0"/>
-            </w:pPr>
-            <w:r>
-              <w:rPr>
-                <w:sz w:val="18"/>
-              </w:rPr>
-            </w:r>
-            <w:r>
-              <w:rPr>
-                <w:sz w:val="18"/>
-              </w:rPr>
-              <w:t>Pigmento que se mezcla con el material para dar color; su dosificación por producto está en Panel Admin → Master.</w:t>
-            </w:r>
-          </w:p>
-        </w:tc>
-      </w:tr>
-      <w:tr>
-        <w:tc>
-          <w:tcPr>
-            <w:tcW w:type="dxa" w:w="2381"/>
+            <w:tcW w:type="dxa" w:w="2494"/>
           </w:tcPr>
           <w:p>
             <w:pPr>
@@ -1832,7 +1674,7 @@
         </w:tc>
         <w:tc>
           <w:tcPr>
-            <w:tcW w:type="dxa" w:w="7710"/>
+            <w:tcW w:type="dxa" w:w="7597"/>
           </w:tcPr>
           <w:p>
             <w:pPr>
@@ -1847,139 +1689,7 @@
               <w:rPr>
                 <w:sz w:val="18"/>
               </w:rPr>
-              <w:t>Material ya mezclado con master que no se usó; vuelve al depósito con un código propio y no se mezcla con material virgen.</w:t>
-            </w:r>
-          </w:p>
-        </w:tc>
-      </w:tr>
-      <w:tr>
-        <w:tc>
-          <w:tcPr>
-            <w:tcW w:type="dxa" w:w="2381"/>
-          </w:tcPr>
-          <w:p>
-            <w:pPr>
-              <w:spacing w:after="0"/>
-            </w:pPr>
-            <w:r>
-              <w:rPr>
-                <w:sz w:val="18"/>
-              </w:rPr>
-            </w:r>
-            <w:r>
-              <w:rPr>
-                <w:sz w:val="18"/>
-              </w:rPr>
-              <w:t>Primer control / control final</w:t>
-            </w:r>
-          </w:p>
-        </w:tc>
-        <w:tc>
-          <w:tcPr>
-            <w:tcW w:type="dxa" w:w="7710"/>
-          </w:tcPr>
-          <w:p>
-            <w:pPr>
-              <w:spacing w:after="0"/>
-            </w:pPr>
-            <w:r>
-              <w:rPr>
-                <w:sz w:val="18"/>
-              </w:rPr>
-            </w:r>
-            <w:r>
-              <w:rPr>
-                <w:sz w:val="18"/>
-              </w:rPr>
-              <w:t>Dos lecturas de lo que sale: una al armar el despacho y otra al entregarlo. Deben coincidir.</w:t>
-            </w:r>
-          </w:p>
-        </w:tc>
-      </w:tr>
-      <w:tr>
-        <w:tc>
-          <w:tcPr>
-            <w:tcW w:type="dxa" w:w="2381"/>
-          </w:tcPr>
-          <w:p>
-            <w:pPr>
-              <w:spacing w:after="0"/>
-            </w:pPr>
-            <w:r>
-              <w:rPr>
-                <w:sz w:val="18"/>
-              </w:rPr>
-            </w:r>
-            <w:r>
-              <w:rPr>
-                <w:sz w:val="18"/>
-              </w:rPr>
-              <w:t>Remito interno / legal</w:t>
-            </w:r>
-          </w:p>
-        </w:tc>
-        <w:tc>
-          <w:tcPr>
-            <w:tcW w:type="dxa" w:w="7710"/>
-          </w:tcPr>
-          <w:p>
-            <w:pPr>
-              <w:spacing w:after="0"/>
-            </w:pPr>
-            <w:r>
-              <w:rPr>
-                <w:sz w:val="18"/>
-              </w:rPr>
-            </w:r>
-            <w:r>
-              <w:rPr>
-                <w:sz w:val="18"/>
-              </w:rPr>
-              <w:t>El interno (R-000001…) lo numera el sistema al entregar; el legal es el comprobante fiscal, que Administración registra después.</w:t>
-            </w:r>
-          </w:p>
-        </w:tc>
-      </w:tr>
-      <w:tr>
-        <w:tc>
-          <w:tcPr>
-            <w:tcW w:type="dxa" w:w="2381"/>
-          </w:tcPr>
-          <w:p>
-            <w:pPr>
-              <w:spacing w:after="0"/>
-            </w:pPr>
-            <w:r>
-              <w:rPr>
-                <w:sz w:val="18"/>
-              </w:rPr>
-            </w:r>
-            <w:r>
-              <w:rPr>
-                <w:sz w:val="18"/>
-              </w:rPr>
-              <w:t>Situación del pedido</w:t>
-            </w:r>
-          </w:p>
-        </w:tc>
-        <w:tc>
-          <w:tcPr>
-            <w:tcW w:type="dxa" w:w="7710"/>
-          </w:tcPr>
-          <w:p>
-            <w:pPr>
-              <w:spacing w:after="0"/>
-            </w:pPr>
-            <w:r>
-              <w:rPr>
-                <w:sz w:val="18"/>
-              </w:rPr>
-            </w:r>
-            <w:r>
-              <w:rPr>
-                <w:sz w:val="18"/>
-              </w:rPr>
-              <w:t>Indica si el stock alcanza para armarlo o cuánto falta producir, respetando el orden de prioridad de todos los pedidos.</w:t>
+              <w:t>Material con master bajado de la tolva; vuelve con código propio, no como virgen.</w:t>
             </w:r>
           </w:p>
         </w:tc>

</xml_diff>